<commit_message>
docs: add RHEL 8.3 deployment guidance
</commit_message>
<xml_diff>
--- a/docs/Vision-Platform-Operation-SOP.docx
+++ b/docs/Vision-Platform-Operation-SOP.docx
@@ -65,7 +65,7 @@
           <w:rFonts w:ascii="Microsoft YaHei" w:hAnsi="Microsoft YaHei" w:eastAsia="Microsoft YaHei"/>
           <w:sz w:val="18"/>
         </w:rPr>
-        <w:t>V1.0</w:t>
+        <w:t>V1.1</w:t>
       </w:r>
     </w:p>
     <w:p>
@@ -107,7 +107,7 @@
           <w:rFonts w:ascii="Microsoft YaHei" w:hAnsi="Microsoft YaHei" w:eastAsia="Microsoft YaHei"/>
           <w:sz w:val="18"/>
         </w:rPr>
-        <w:t>Windows 本地部署 / NVIDIA GPU</w:t>
+        <w:t>Windows 本地部署 / Red Hat Enterprise Linux 8.3 / NVIDIA GPU</w:t>
       </w:r>
     </w:p>
     <w:p>
@@ -180,7 +180,7 @@
           <w:rFonts w:ascii="Microsoft YaHei" w:hAnsi="Microsoft YaHei" w:eastAsia="Microsoft YaHei"/>
           <w:sz w:val="18"/>
         </w:rPr>
-        <w:t>本 SOP 按现场平台端口 9011 编写。模型服务采用单进程常驻方式，启动后必须确认状态为 READY，再执行配方测试或生产检测。</w:t>
+        <w:t>本 SOP 按现场平台端口 9011 编写，兼容 Windows 与 Red Hat Enterprise Linux 8.3。模型服务采用单进程常驻方式，启动后必须确认状态为 READY，再执行配方测试或生产检测。</w:t>
       </w:r>
     </w:p>
     <w:p>
@@ -970,6 +970,83 @@
                 <w:sz w:val="16"/>
               </w:rPr>
               <w:t>班组 / 项目负责人</w:t>
+            </w:r>
+          </w:p>
+        </w:tc>
+      </w:tr>
+      <w:tr>
+        <w:tc>
+          <w:tcPr>
+            <w:tcW w:type="dxa" w:w="936"/>
+            <w:tcMar>
+              <w:top w:w="90" w:type="dxa"/>
+              <w:start w:w="100" w:type="dxa"/>
+              <w:bottom w:w="90" w:type="dxa"/>
+              <w:end w:w="100" w:type="dxa"/>
+            </w:tcMar>
+            <w:shd w:fill="F8FAFC"/>
+            <w:vAlign w:val="center"/>
+          </w:tcPr>
+          <w:p>
+            <w:pPr>
+              <w:spacing w:after="0"/>
+            </w:pPr>
+            <w:r>
+              <w:rPr>
+                <w:rFonts w:ascii="Microsoft YaHei" w:hAnsi="Microsoft YaHei" w:eastAsia="Microsoft YaHei"/>
+                <w:sz w:val="16"/>
+              </w:rPr>
+              <w:t>附录 A</w:t>
+            </w:r>
+          </w:p>
+        </w:tc>
+        <w:tc>
+          <w:tcPr>
+            <w:tcW w:type="dxa" w:w="6696"/>
+            <w:tcMar>
+              <w:top w:w="90" w:type="dxa"/>
+              <w:start w:w="100" w:type="dxa"/>
+              <w:bottom w:w="90" w:type="dxa"/>
+              <w:end w:w="100" w:type="dxa"/>
+            </w:tcMar>
+            <w:shd w:fill="F8FAFC"/>
+            <w:vAlign w:val="center"/>
+          </w:tcPr>
+          <w:p>
+            <w:pPr>
+              <w:spacing w:after="0"/>
+            </w:pPr>
+            <w:r>
+              <w:rPr>
+                <w:rFonts w:ascii="Microsoft YaHei" w:hAnsi="Microsoft YaHei" w:eastAsia="Microsoft YaHei"/>
+                <w:sz w:val="16"/>
+              </w:rPr>
+              <w:t>Red Hat Enterprise Linux 8.3 兼容与部署</w:t>
+            </w:r>
+          </w:p>
+        </w:tc>
+        <w:tc>
+          <w:tcPr>
+            <w:tcW w:type="dxa" w:w="2592"/>
+            <w:tcMar>
+              <w:top w:w="90" w:type="dxa"/>
+              <w:start w:w="100" w:type="dxa"/>
+              <w:bottom w:w="90" w:type="dxa"/>
+              <w:end w:w="100" w:type="dxa"/>
+            </w:tcMar>
+            <w:shd w:fill="F8FAFC"/>
+            <w:vAlign w:val="center"/>
+          </w:tcPr>
+          <w:p>
+            <w:pPr>
+              <w:spacing w:after="0"/>
+            </w:pPr>
+            <w:r>
+              <w:rPr>
+                <w:rFonts w:ascii="Microsoft YaHei" w:hAnsi="Microsoft YaHei" w:eastAsia="Microsoft YaHei"/>
+                <w:sz w:val="16"/>
+              </w:rPr>
+              <w:t>Linux 运维 / 部署工程师</w:t>
             </w:r>
           </w:p>
         </w:tc>
@@ -7142,7 +7219,7 @@
                 <w:rFonts w:ascii="Microsoft YaHei" w:hAnsi="Microsoft YaHei" w:eastAsia="Microsoft YaHei"/>
                 <w:sz w:val="16"/>
               </w:rPr>
-              <w:t>V1.0</w:t>
+              <w:t>V1.1</w:t>
             </w:r>
           </w:p>
         </w:tc>
@@ -7190,6 +7267,107 @@
                 <w:rFonts w:ascii="Microsoft YaHei" w:hAnsi="Microsoft YaHei" w:eastAsia="Microsoft YaHei"/>
                 <w:sz w:val="16"/>
               </w:rPr>
+              <w:t>补充 RHEL 8.3 兼容矩阵、systemd、SELinux 和上线检查</w:t>
+            </w:r>
+          </w:p>
+        </w:tc>
+        <w:tc>
+          <w:tcPr>
+            <w:tcW w:type="dxa" w:w="1944"/>
+            <w:tcMar>
+              <w:top w:w="90" w:type="dxa"/>
+              <w:start w:w="100" w:type="dxa"/>
+              <w:bottom w:w="90" w:type="dxa"/>
+              <w:end w:w="100" w:type="dxa"/>
+            </w:tcMar>
+            <w:vAlign w:val="center"/>
+          </w:tcPr>
+          <w:p>
+            <w:pPr>
+              <w:spacing w:after="0"/>
+            </w:pPr>
+            <w:r>
+              <w:rPr>
+                <w:rFonts w:ascii="Microsoft YaHei" w:hAnsi="Microsoft YaHei" w:eastAsia="Microsoft YaHei"/>
+                <w:sz w:val="16"/>
+              </w:rPr>
+              <w:t>项目组 / 待审核</w:t>
+            </w:r>
+          </w:p>
+        </w:tc>
+      </w:tr>
+      <w:tr>
+        <w:tc>
+          <w:tcPr>
+            <w:tcW w:type="dxa" w:w="1152"/>
+            <w:tcMar>
+              <w:top w:w="90" w:type="dxa"/>
+              <w:start w:w="100" w:type="dxa"/>
+              <w:bottom w:w="90" w:type="dxa"/>
+              <w:end w:w="100" w:type="dxa"/>
+            </w:tcMar>
+            <w:shd w:fill="F8FAFC"/>
+            <w:vAlign w:val="center"/>
+          </w:tcPr>
+          <w:p>
+            <w:pPr>
+              <w:spacing w:after="0"/>
+            </w:pPr>
+            <w:r>
+              <w:rPr>
+                <w:rFonts w:ascii="Microsoft YaHei" w:hAnsi="Microsoft YaHei" w:eastAsia="Microsoft YaHei"/>
+                <w:sz w:val="16"/>
+              </w:rPr>
+              <w:t>V1.0</w:t>
+            </w:r>
+          </w:p>
+        </w:tc>
+        <w:tc>
+          <w:tcPr>
+            <w:tcW w:type="dxa" w:w="1728"/>
+            <w:tcMar>
+              <w:top w:w="90" w:type="dxa"/>
+              <w:start w:w="100" w:type="dxa"/>
+              <w:bottom w:w="90" w:type="dxa"/>
+              <w:end w:w="100" w:type="dxa"/>
+            </w:tcMar>
+            <w:shd w:fill="F8FAFC"/>
+            <w:vAlign w:val="center"/>
+          </w:tcPr>
+          <w:p>
+            <w:pPr>
+              <w:spacing w:after="0"/>
+            </w:pPr>
+            <w:r>
+              <w:rPr>
+                <w:rFonts w:ascii="Microsoft YaHei" w:hAnsi="Microsoft YaHei" w:eastAsia="Microsoft YaHei"/>
+                <w:sz w:val="16"/>
+              </w:rPr>
+              <w:t>2026-08-02</w:t>
+            </w:r>
+          </w:p>
+        </w:tc>
+        <w:tc>
+          <w:tcPr>
+            <w:tcW w:type="dxa" w:w="6120"/>
+            <w:tcMar>
+              <w:top w:w="90" w:type="dxa"/>
+              <w:start w:w="100" w:type="dxa"/>
+              <w:bottom w:w="90" w:type="dxa"/>
+              <w:end w:w="100" w:type="dxa"/>
+            </w:tcMar>
+            <w:shd w:fill="F8FAFC"/>
+            <w:vAlign w:val="center"/>
+          </w:tcPr>
+          <w:p>
+            <w:pPr>
+              <w:spacing w:after="0"/>
+            </w:pPr>
+            <w:r>
+              <w:rPr>
+                <w:rFonts w:ascii="Microsoft YaHei" w:hAnsi="Microsoft YaHei" w:eastAsia="Microsoft YaHei"/>
+                <w:sz w:val="16"/>
+              </w:rPr>
               <w:t>首次发布：服务启动、接口、配方、VLM 复核和排障</w:t>
             </w:r>
           </w:p>
@@ -7203,6 +7381,7 @@
               <w:bottom w:w="90" w:type="dxa"/>
               <w:end w:w="100" w:type="dxa"/>
             </w:tcMar>
+            <w:shd w:fill="F8FAFC"/>
             <w:vAlign w:val="center"/>
           </w:tcPr>
           <w:p>
@@ -7249,6 +7428,2041 @@
           <w:sz w:val="18"/>
         </w:rPr>
         <w:t>本 SOP 应与实际 .env 端口、模型目录和生产配方规则保持一致。现场配置发生变化时，应同步修订文档版本。</w:t>
+      </w:r>
+    </w:p>
+    <w:p>
+      <w:r>
+        <w:br w:type="page"/>
+      </w:r>
+    </w:p>
+    <w:p>
+      <w:pPr>
+        <w:pStyle w:val="Heading1"/>
+        <w:keepNext/>
+      </w:pPr>
+      <w:r>
+        <w:t>附录 A. Red Hat Enterprise Linux 8.3 兼容与部署</w:t>
+      </w:r>
+    </w:p>
+    <w:p>
+      <w:pPr>
+        <w:spacing w:before="80" w:after="140"/>
+        <w:ind w:left="198"/>
+        <w:shd w:fill="E8F5F2"/>
+        <w:pBdr>
+          <w:left w:val="single" w:sz="24" w:space="6" w:color="067647"/>
+        </w:pBdr>
+      </w:pPr>
+      <w:r>
+        <w:rPr>
+          <w:rFonts w:ascii="Microsoft YaHei" w:hAnsi="Microsoft YaHei" w:eastAsia="Microsoft YaHei"/>
+          <w:b/>
+          <w:color w:val="067647"/>
+          <w:sz w:val="18"/>
+        </w:rPr>
+        <w:t xml:space="preserve">兼容结论  </w:t>
+      </w:r>
+      <w:r>
+        <w:rPr>
+          <w:rFonts w:ascii="Microsoft YaHei" w:hAnsi="Microsoft YaHei" w:eastAsia="Microsoft YaHei"/>
+          <w:sz w:val="18"/>
+        </w:rPr>
+        <w:t>vision-platform 的 FastAPI、SQLAlchemy、SQLite、pathlib 路径处理、模型 HTTP 接口和 start.sh 均可运行在 Red Hat Enterprise Linux 8.3 x86_64。部署前必须准备 Python 3.11、匹配的 NVIDIA 驱动/CUDA 和 Linux 版模型依赖；不能直接复制 Windows 虚拟环境。</w:t>
+      </w:r>
+    </w:p>
+    <w:p>
+      <w:pPr>
+        <w:pStyle w:val="Heading2"/>
+        <w:keepNext/>
+      </w:pPr>
+      <w:r>
+        <w:t>A.1 兼容性矩阵</w:t>
+      </w:r>
+    </w:p>
+    <w:tbl>
+      <w:tblPr>
+        <w:tblStyle w:val="TableGrid"/>
+        <w:tblW w:type="auto" w:w="0"/>
+        <w:jc w:val="center"/>
+        <w:tblLayout w:type="fixed"/>
+        <w:tblLook w:firstColumn="1" w:firstRow="1" w:lastColumn="0" w:lastRow="0" w:noHBand="0" w:noVBand="1" w:val="04A0"/>
+      </w:tblPr>
+      <w:tblGrid>
+        <w:gridCol w:w="3293"/>
+        <w:gridCol w:w="3293"/>
+        <w:gridCol w:w="3293"/>
+      </w:tblGrid>
+      <w:tr>
+        <w:trPr>
+          <w:tblHeader w:val="true"/>
+        </w:trPr>
+        <w:tc>
+          <w:tcPr>
+            <w:tcW w:type="dxa" w:w="2592"/>
+            <w:shd w:fill="17365D"/>
+            <w:vAlign w:val="center"/>
+            <w:tcMar>
+              <w:top w:w="90" w:type="dxa"/>
+              <w:start w:w="100" w:type="dxa"/>
+              <w:bottom w:w="90" w:type="dxa"/>
+              <w:end w:w="100" w:type="dxa"/>
+            </w:tcMar>
+          </w:tcPr>
+          <w:p>
+            <w:pPr>
+              <w:jc w:val="center"/>
+            </w:pPr>
+            <w:r>
+              <w:rPr>
+                <w:rFonts w:ascii="Microsoft YaHei" w:hAnsi="Microsoft YaHei" w:eastAsia="Microsoft YaHei"/>
+                <w:b/>
+                <w:color w:val="FFFFFF"/>
+                <w:sz w:val="17"/>
+              </w:rPr>
+              <w:t>模块</w:t>
+            </w:r>
+          </w:p>
+        </w:tc>
+        <w:tc>
+          <w:tcPr>
+            <w:tcW w:type="dxa" w:w="1872"/>
+            <w:shd w:fill="17365D"/>
+            <w:vAlign w:val="center"/>
+            <w:tcMar>
+              <w:top w:w="90" w:type="dxa"/>
+              <w:start w:w="100" w:type="dxa"/>
+              <w:bottom w:w="90" w:type="dxa"/>
+              <w:end w:w="100" w:type="dxa"/>
+            </w:tcMar>
+          </w:tcPr>
+          <w:p>
+            <w:pPr>
+              <w:jc w:val="center"/>
+            </w:pPr>
+            <w:r>
+              <w:rPr>
+                <w:rFonts w:ascii="Microsoft YaHei" w:hAnsi="Microsoft YaHei" w:eastAsia="Microsoft YaHei"/>
+                <w:b/>
+                <w:color w:val="FFFFFF"/>
+                <w:sz w:val="17"/>
+              </w:rPr>
+              <w:t>RHEL 8.3 状态</w:t>
+            </w:r>
+          </w:p>
+        </w:tc>
+        <w:tc>
+          <w:tcPr>
+            <w:tcW w:type="dxa" w:w="5903"/>
+            <w:shd w:fill="17365D"/>
+            <w:vAlign w:val="center"/>
+            <w:tcMar>
+              <w:top w:w="90" w:type="dxa"/>
+              <w:start w:w="100" w:type="dxa"/>
+              <w:bottom w:w="90" w:type="dxa"/>
+              <w:end w:w="100" w:type="dxa"/>
+            </w:tcMar>
+          </w:tcPr>
+          <w:p>
+            <w:pPr>
+              <w:jc w:val="center"/>
+            </w:pPr>
+            <w:r>
+              <w:rPr>
+                <w:rFonts w:ascii="Microsoft YaHei" w:hAnsi="Microsoft YaHei" w:eastAsia="Microsoft YaHei"/>
+                <w:b/>
+                <w:color w:val="FFFFFF"/>
+                <w:sz w:val="17"/>
+              </w:rPr>
+              <w:t>部署要求</w:t>
+            </w:r>
+          </w:p>
+        </w:tc>
+      </w:tr>
+      <w:tr>
+        <w:tc>
+          <w:tcPr>
+            <w:tcW w:type="dxa" w:w="2592"/>
+            <w:tcMar>
+              <w:top w:w="90" w:type="dxa"/>
+              <w:start w:w="100" w:type="dxa"/>
+              <w:bottom w:w="90" w:type="dxa"/>
+              <w:end w:w="100" w:type="dxa"/>
+            </w:tcMar>
+            <w:vAlign w:val="center"/>
+          </w:tcPr>
+          <w:p>
+            <w:pPr>
+              <w:spacing w:after="0"/>
+            </w:pPr>
+            <w:r>
+              <w:rPr>
+                <w:rFonts w:ascii="Microsoft YaHei" w:hAnsi="Microsoft YaHei" w:eastAsia="Microsoft YaHei"/>
+                <w:sz w:val="16"/>
+              </w:rPr>
+              <w:t>Vision Platform 主服务</w:t>
+            </w:r>
+          </w:p>
+        </w:tc>
+        <w:tc>
+          <w:tcPr>
+            <w:tcW w:type="dxa" w:w="1872"/>
+            <w:tcMar>
+              <w:top w:w="90" w:type="dxa"/>
+              <w:start w:w="100" w:type="dxa"/>
+              <w:bottom w:w="90" w:type="dxa"/>
+              <w:end w:w="100" w:type="dxa"/>
+            </w:tcMar>
+            <w:vAlign w:val="center"/>
+          </w:tcPr>
+          <w:p>
+            <w:pPr>
+              <w:spacing w:after="0"/>
+            </w:pPr>
+            <w:r>
+              <w:rPr>
+                <w:rFonts w:ascii="Microsoft YaHei" w:hAnsi="Microsoft YaHei" w:eastAsia="Microsoft YaHei"/>
+                <w:sz w:val="16"/>
+              </w:rPr>
+              <w:t>兼容</w:t>
+            </w:r>
+          </w:p>
+        </w:tc>
+        <w:tc>
+          <w:tcPr>
+            <w:tcW w:type="dxa" w:w="5903"/>
+            <w:tcMar>
+              <w:top w:w="90" w:type="dxa"/>
+              <w:start w:w="100" w:type="dxa"/>
+              <w:bottom w:w="90" w:type="dxa"/>
+              <w:end w:w="100" w:type="dxa"/>
+            </w:tcMar>
+            <w:vAlign w:val="center"/>
+          </w:tcPr>
+          <w:p>
+            <w:pPr>
+              <w:spacing w:after="0"/>
+            </w:pPr>
+            <w:r>
+              <w:rPr>
+                <w:rFonts w:ascii="Microsoft YaHei" w:hAnsi="Microsoft YaHei" w:eastAsia="Microsoft YaHei"/>
+                <w:sz w:val="16"/>
+              </w:rPr>
+              <w:t>使用 Linux Python 3.11 虚拟环境和 start.sh/systemd</w:t>
+            </w:r>
+          </w:p>
+        </w:tc>
+      </w:tr>
+      <w:tr>
+        <w:tc>
+          <w:tcPr>
+            <w:tcW w:type="dxa" w:w="2592"/>
+            <w:tcMar>
+              <w:top w:w="90" w:type="dxa"/>
+              <w:start w:w="100" w:type="dxa"/>
+              <w:bottom w:w="90" w:type="dxa"/>
+              <w:end w:w="100" w:type="dxa"/>
+            </w:tcMar>
+            <w:shd w:fill="F8FAFC"/>
+            <w:vAlign w:val="center"/>
+          </w:tcPr>
+          <w:p>
+            <w:pPr>
+              <w:spacing w:after="0"/>
+            </w:pPr>
+            <w:r>
+              <w:rPr>
+                <w:rFonts w:ascii="Microsoft YaHei" w:hAnsi="Microsoft YaHei" w:eastAsia="Microsoft YaHei"/>
+                <w:sz w:val="16"/>
+              </w:rPr>
+              <w:t>配方、ROI、规则与 SQLite</w:t>
+            </w:r>
+          </w:p>
+        </w:tc>
+        <w:tc>
+          <w:tcPr>
+            <w:tcW w:type="dxa" w:w="1872"/>
+            <w:tcMar>
+              <w:top w:w="90" w:type="dxa"/>
+              <w:start w:w="100" w:type="dxa"/>
+              <w:bottom w:w="90" w:type="dxa"/>
+              <w:end w:w="100" w:type="dxa"/>
+            </w:tcMar>
+            <w:shd w:fill="F8FAFC"/>
+            <w:vAlign w:val="center"/>
+          </w:tcPr>
+          <w:p>
+            <w:pPr>
+              <w:spacing w:after="0"/>
+            </w:pPr>
+            <w:r>
+              <w:rPr>
+                <w:rFonts w:ascii="Microsoft YaHei" w:hAnsi="Microsoft YaHei" w:eastAsia="Microsoft YaHei"/>
+                <w:sz w:val="16"/>
+              </w:rPr>
+              <w:t>兼容</w:t>
+            </w:r>
+          </w:p>
+        </w:tc>
+        <w:tc>
+          <w:tcPr>
+            <w:tcW w:type="dxa" w:w="5903"/>
+            <w:tcMar>
+              <w:top w:w="90" w:type="dxa"/>
+              <w:start w:w="100" w:type="dxa"/>
+              <w:bottom w:w="90" w:type="dxa"/>
+              <w:end w:w="100" w:type="dxa"/>
+            </w:tcMar>
+            <w:shd w:fill="F8FAFC"/>
+            <w:vAlign w:val="center"/>
+          </w:tcPr>
+          <w:p>
+            <w:pPr>
+              <w:spacing w:after="0"/>
+            </w:pPr>
+            <w:r>
+              <w:rPr>
+                <w:rFonts w:ascii="Microsoft YaHei" w:hAnsi="Microsoft YaHei" w:eastAsia="Microsoft YaHei"/>
+                <w:sz w:val="16"/>
+              </w:rPr>
+              <w:t>数据库路径改为 Linux 绝对路径并授予写权限</w:t>
+            </w:r>
+          </w:p>
+        </w:tc>
+      </w:tr>
+      <w:tr>
+        <w:tc>
+          <w:tcPr>
+            <w:tcW w:type="dxa" w:w="2592"/>
+            <w:tcMar>
+              <w:top w:w="90" w:type="dxa"/>
+              <w:start w:w="100" w:type="dxa"/>
+              <w:bottom w:w="90" w:type="dxa"/>
+              <w:end w:w="100" w:type="dxa"/>
+            </w:tcMar>
+            <w:vAlign w:val="center"/>
+          </w:tcPr>
+          <w:p>
+            <w:pPr>
+              <w:spacing w:after="0"/>
+            </w:pPr>
+            <w:r>
+              <w:rPr>
+                <w:rFonts w:ascii="Microsoft YaHei" w:hAnsi="Microsoft YaHei" w:eastAsia="Microsoft YaHei"/>
+                <w:sz w:val="16"/>
+              </w:rPr>
+              <w:t>DINOv2 / Grounding DINO</w:t>
+            </w:r>
+          </w:p>
+        </w:tc>
+        <w:tc>
+          <w:tcPr>
+            <w:tcW w:type="dxa" w:w="1872"/>
+            <w:tcMar>
+              <w:top w:w="90" w:type="dxa"/>
+              <w:start w:w="100" w:type="dxa"/>
+              <w:bottom w:w="90" w:type="dxa"/>
+              <w:end w:w="100" w:type="dxa"/>
+            </w:tcMar>
+            <w:vAlign w:val="center"/>
+          </w:tcPr>
+          <w:p>
+            <w:pPr>
+              <w:spacing w:after="0"/>
+            </w:pPr>
+            <w:r>
+              <w:rPr>
+                <w:rFonts w:ascii="Microsoft YaHei" w:hAnsi="Microsoft YaHei" w:eastAsia="Microsoft YaHei"/>
+                <w:sz w:val="16"/>
+              </w:rPr>
+              <w:t>兼容</w:t>
+            </w:r>
+          </w:p>
+        </w:tc>
+        <w:tc>
+          <w:tcPr>
+            <w:tcW w:type="dxa" w:w="5903"/>
+            <w:tcMar>
+              <w:top w:w="90" w:type="dxa"/>
+              <w:start w:w="100" w:type="dxa"/>
+              <w:bottom w:w="90" w:type="dxa"/>
+              <w:end w:w="100" w:type="dxa"/>
+            </w:tcMar>
+            <w:vAlign w:val="center"/>
+          </w:tcPr>
+          <w:p>
+            <w:pPr>
+              <w:spacing w:after="0"/>
+            </w:pPr>
+            <w:r>
+              <w:rPr>
+                <w:rFonts w:ascii="Microsoft YaHei" w:hAnsi="Microsoft YaHei" w:eastAsia="Microsoft YaHei"/>
+                <w:sz w:val="16"/>
+              </w:rPr>
+              <w:t>安装与 CUDA 对应的 Linux PyTorch</w:t>
+            </w:r>
+          </w:p>
+        </w:tc>
+      </w:tr>
+      <w:tr>
+        <w:tc>
+          <w:tcPr>
+            <w:tcW w:type="dxa" w:w="2592"/>
+            <w:tcMar>
+              <w:top w:w="90" w:type="dxa"/>
+              <w:start w:w="100" w:type="dxa"/>
+              <w:bottom w:w="90" w:type="dxa"/>
+              <w:end w:w="100" w:type="dxa"/>
+            </w:tcMar>
+            <w:shd w:fill="F8FAFC"/>
+            <w:vAlign w:val="center"/>
+          </w:tcPr>
+          <w:p>
+            <w:pPr>
+              <w:spacing w:after="0"/>
+            </w:pPr>
+            <w:r>
+              <w:rPr>
+                <w:rFonts w:ascii="Microsoft YaHei" w:hAnsi="Microsoft YaHei" w:eastAsia="Microsoft YaHei"/>
+                <w:sz w:val="16"/>
+              </w:rPr>
+              <w:t>Qwen3-VL 4B</w:t>
+            </w:r>
+          </w:p>
+        </w:tc>
+        <w:tc>
+          <w:tcPr>
+            <w:tcW w:type="dxa" w:w="1872"/>
+            <w:tcMar>
+              <w:top w:w="90" w:type="dxa"/>
+              <w:start w:w="100" w:type="dxa"/>
+              <w:bottom w:w="90" w:type="dxa"/>
+              <w:end w:w="100" w:type="dxa"/>
+            </w:tcMar>
+            <w:shd w:fill="F8FAFC"/>
+            <w:vAlign w:val="center"/>
+          </w:tcPr>
+          <w:p>
+            <w:pPr>
+              <w:spacing w:after="0"/>
+            </w:pPr>
+            <w:r>
+              <w:rPr>
+                <w:rFonts w:ascii="Microsoft YaHei" w:hAnsi="Microsoft YaHei" w:eastAsia="Microsoft YaHei"/>
+                <w:sz w:val="16"/>
+              </w:rPr>
+              <w:t>兼容</w:t>
+            </w:r>
+          </w:p>
+        </w:tc>
+        <w:tc>
+          <w:tcPr>
+            <w:tcW w:type="dxa" w:w="5903"/>
+            <w:tcMar>
+              <w:top w:w="90" w:type="dxa"/>
+              <w:start w:w="100" w:type="dxa"/>
+              <w:bottom w:w="90" w:type="dxa"/>
+              <w:end w:w="100" w:type="dxa"/>
+            </w:tcMar>
+            <w:shd w:fill="F8FAFC"/>
+            <w:vAlign w:val="center"/>
+          </w:tcPr>
+          <w:p>
+            <w:pPr>
+              <w:spacing w:after="0"/>
+            </w:pPr>
+            <w:r>
+              <w:rPr>
+                <w:rFonts w:ascii="Microsoft YaHei" w:hAnsi="Microsoft YaHei" w:eastAsia="Microsoft YaHei"/>
+                <w:sz w:val="16"/>
+              </w:rPr>
+              <w:t>Linux CUDA 环境；4bit 量化需验证 bitsandbytes 兼容性</w:t>
+            </w:r>
+          </w:p>
+        </w:tc>
+      </w:tr>
+      <w:tr>
+        <w:tc>
+          <w:tcPr>
+            <w:tcW w:type="dxa" w:w="2592"/>
+            <w:tcMar>
+              <w:top w:w="90" w:type="dxa"/>
+              <w:start w:w="100" w:type="dxa"/>
+              <w:bottom w:w="90" w:type="dxa"/>
+              <w:end w:w="100" w:type="dxa"/>
+            </w:tcMar>
+            <w:vAlign w:val="center"/>
+          </w:tcPr>
+          <w:p>
+            <w:pPr>
+              <w:spacing w:after="0"/>
+            </w:pPr>
+            <w:r>
+              <w:rPr>
+                <w:rFonts w:ascii="Microsoft YaHei" w:hAnsi="Microsoft YaHei" w:eastAsia="Microsoft YaHei"/>
+                <w:sz w:val="16"/>
+              </w:rPr>
+              <w:t>PaddleOCR</w:t>
+            </w:r>
+          </w:p>
+        </w:tc>
+        <w:tc>
+          <w:tcPr>
+            <w:tcW w:type="dxa" w:w="1872"/>
+            <w:tcMar>
+              <w:top w:w="90" w:type="dxa"/>
+              <w:start w:w="100" w:type="dxa"/>
+              <w:bottom w:w="90" w:type="dxa"/>
+              <w:end w:w="100" w:type="dxa"/>
+            </w:tcMar>
+            <w:vAlign w:val="center"/>
+          </w:tcPr>
+          <w:p>
+            <w:pPr>
+              <w:spacing w:after="0"/>
+            </w:pPr>
+            <w:r>
+              <w:rPr>
+                <w:rFonts w:ascii="Microsoft YaHei" w:hAnsi="Microsoft YaHei" w:eastAsia="Microsoft YaHei"/>
+                <w:sz w:val="16"/>
+              </w:rPr>
+              <w:t>兼容</w:t>
+            </w:r>
+          </w:p>
+        </w:tc>
+        <w:tc>
+          <w:tcPr>
+            <w:tcW w:type="dxa" w:w="5903"/>
+            <w:tcMar>
+              <w:top w:w="90" w:type="dxa"/>
+              <w:start w:w="100" w:type="dxa"/>
+              <w:bottom w:w="90" w:type="dxa"/>
+              <w:end w:w="100" w:type="dxa"/>
+            </w:tcMar>
+            <w:vAlign w:val="center"/>
+          </w:tcPr>
+          <w:p>
+            <w:pPr>
+              <w:spacing w:after="0"/>
+            </w:pPr>
+            <w:r>
+              <w:rPr>
+                <w:rFonts w:ascii="Microsoft YaHei" w:hAnsi="Microsoft YaHei" w:eastAsia="Microsoft YaHei"/>
+                <w:sz w:val="16"/>
+              </w:rPr>
+              <w:t>按 CUDA/CPU 版本安装 Linux PaddlePaddle</w:t>
+            </w:r>
+          </w:p>
+        </w:tc>
+      </w:tr>
+      <w:tr>
+        <w:tc>
+          <w:tcPr>
+            <w:tcW w:type="dxa" w:w="2592"/>
+            <w:tcMar>
+              <w:top w:w="90" w:type="dxa"/>
+              <w:start w:w="100" w:type="dxa"/>
+              <w:bottom w:w="90" w:type="dxa"/>
+              <w:end w:w="100" w:type="dxa"/>
+            </w:tcMar>
+            <w:shd w:fill="F8FAFC"/>
+            <w:vAlign w:val="center"/>
+          </w:tcPr>
+          <w:p>
+            <w:pPr>
+              <w:spacing w:after="0"/>
+            </w:pPr>
+            <w:r>
+              <w:rPr>
+                <w:rFonts w:ascii="Microsoft YaHei" w:hAnsi="Microsoft YaHei" w:eastAsia="Microsoft YaHei"/>
+                <w:sz w:val="16"/>
+              </w:rPr>
+              <w:t>SAM2</w:t>
+            </w:r>
+          </w:p>
+        </w:tc>
+        <w:tc>
+          <w:tcPr>
+            <w:tcW w:type="dxa" w:w="1872"/>
+            <w:tcMar>
+              <w:top w:w="90" w:type="dxa"/>
+              <w:start w:w="100" w:type="dxa"/>
+              <w:bottom w:w="90" w:type="dxa"/>
+              <w:end w:w="100" w:type="dxa"/>
+            </w:tcMar>
+            <w:shd w:fill="F8FAFC"/>
+            <w:vAlign w:val="center"/>
+          </w:tcPr>
+          <w:p>
+            <w:pPr>
+              <w:spacing w:after="0"/>
+            </w:pPr>
+            <w:r>
+              <w:rPr>
+                <w:rFonts w:ascii="Microsoft YaHei" w:hAnsi="Microsoft YaHei" w:eastAsia="Microsoft YaHei"/>
+                <w:sz w:val="16"/>
+              </w:rPr>
+              <w:t>兼容</w:t>
+            </w:r>
+          </w:p>
+        </w:tc>
+        <w:tc>
+          <w:tcPr>
+            <w:tcW w:type="dxa" w:w="5903"/>
+            <w:tcMar>
+              <w:top w:w="90" w:type="dxa"/>
+              <w:start w:w="100" w:type="dxa"/>
+              <w:bottom w:w="90" w:type="dxa"/>
+              <w:end w:w="100" w:type="dxa"/>
+            </w:tcMar>
+            <w:shd w:fill="F8FAFC"/>
+            <w:vAlign w:val="center"/>
+          </w:tcPr>
+          <w:p>
+            <w:pPr>
+              <w:spacing w:after="0"/>
+            </w:pPr>
+            <w:r>
+              <w:rPr>
+                <w:rFonts w:ascii="Microsoft YaHei" w:hAnsi="Microsoft YaHei" w:eastAsia="Microsoft YaHei"/>
+                <w:sz w:val="16"/>
+              </w:rPr>
+              <w:t>准备模型权重、配置文件及 Linux 依赖</w:t>
+            </w:r>
+          </w:p>
+        </w:tc>
+      </w:tr>
+      <w:tr>
+        <w:tc>
+          <w:tcPr>
+            <w:tcW w:type="dxa" w:w="2592"/>
+            <w:tcMar>
+              <w:top w:w="90" w:type="dxa"/>
+              <w:start w:w="100" w:type="dxa"/>
+              <w:bottom w:w="90" w:type="dxa"/>
+              <w:end w:w="100" w:type="dxa"/>
+            </w:tcMar>
+            <w:vAlign w:val="center"/>
+          </w:tcPr>
+          <w:p>
+            <w:pPr>
+              <w:spacing w:after="0"/>
+            </w:pPr>
+            <w:r>
+              <w:rPr>
+                <w:rFonts w:ascii="Microsoft YaHei" w:hAnsi="Microsoft YaHei" w:eastAsia="Microsoft YaHei"/>
+                <w:sz w:val="16"/>
+              </w:rPr>
+              <w:t>网页一键启停</w:t>
+            </w:r>
+          </w:p>
+        </w:tc>
+        <w:tc>
+          <w:tcPr>
+            <w:tcW w:type="dxa" w:w="1872"/>
+            <w:tcMar>
+              <w:top w:w="90" w:type="dxa"/>
+              <w:start w:w="100" w:type="dxa"/>
+              <w:bottom w:w="90" w:type="dxa"/>
+              <w:end w:w="100" w:type="dxa"/>
+            </w:tcMar>
+            <w:vAlign w:val="center"/>
+          </w:tcPr>
+          <w:p>
+            <w:pPr>
+              <w:spacing w:after="0"/>
+            </w:pPr>
+            <w:r>
+              <w:rPr>
+                <w:rFonts w:ascii="Microsoft YaHei" w:hAnsi="Microsoft YaHei" w:eastAsia="Microsoft YaHei"/>
+                <w:sz w:val="16"/>
+              </w:rPr>
+              <w:t>开发环境兼容</w:t>
+            </w:r>
+          </w:p>
+        </w:tc>
+        <w:tc>
+          <w:tcPr>
+            <w:tcW w:type="dxa" w:w="5903"/>
+            <w:tcMar>
+              <w:top w:w="90" w:type="dxa"/>
+              <w:start w:w="100" w:type="dxa"/>
+              <w:bottom w:w="90" w:type="dxa"/>
+              <w:end w:w="100" w:type="dxa"/>
+            </w:tcMar>
+            <w:vAlign w:val="center"/>
+          </w:tcPr>
+          <w:p>
+            <w:pPr>
+              <w:spacing w:after="0"/>
+            </w:pPr>
+            <w:r>
+              <w:rPr>
+                <w:rFonts w:ascii="Microsoft YaHei" w:hAnsi="Microsoft YaHei" w:eastAsia="Microsoft YaHei"/>
+                <w:sz w:val="16"/>
+              </w:rPr>
+              <w:t>生产环境建议由独立 systemd 单元管理</w:t>
+            </w:r>
+          </w:p>
+        </w:tc>
+      </w:tr>
+      <w:tr>
+        <w:tc>
+          <w:tcPr>
+            <w:tcW w:type="dxa" w:w="2592"/>
+            <w:tcMar>
+              <w:top w:w="90" w:type="dxa"/>
+              <w:start w:w="100" w:type="dxa"/>
+              <w:bottom w:w="90" w:type="dxa"/>
+              <w:end w:w="100" w:type="dxa"/>
+            </w:tcMar>
+            <w:shd w:fill="F8FAFC"/>
+            <w:vAlign w:val="center"/>
+          </w:tcPr>
+          <w:p>
+            <w:pPr>
+              <w:spacing w:after="0"/>
+            </w:pPr>
+            <w:r>
+              <w:rPr>
+                <w:rFonts w:ascii="Microsoft YaHei" w:hAnsi="Microsoft YaHei" w:eastAsia="Microsoft YaHei"/>
+                <w:sz w:val="16"/>
+              </w:rPr>
+              <w:t>PowerShell 脚本</w:t>
+            </w:r>
+          </w:p>
+        </w:tc>
+        <w:tc>
+          <w:tcPr>
+            <w:tcW w:type="dxa" w:w="1872"/>
+            <w:tcMar>
+              <w:top w:w="90" w:type="dxa"/>
+              <w:start w:w="100" w:type="dxa"/>
+              <w:bottom w:w="90" w:type="dxa"/>
+              <w:end w:w="100" w:type="dxa"/>
+            </w:tcMar>
+            <w:shd w:fill="F8FAFC"/>
+            <w:vAlign w:val="center"/>
+          </w:tcPr>
+          <w:p>
+            <w:pPr>
+              <w:spacing w:after="0"/>
+            </w:pPr>
+            <w:r>
+              <w:rPr>
+                <w:rFonts w:ascii="Microsoft YaHei" w:hAnsi="Microsoft YaHei" w:eastAsia="Microsoft YaHei"/>
+                <w:sz w:val="16"/>
+              </w:rPr>
+              <w:t>不适用</w:t>
+            </w:r>
+          </w:p>
+        </w:tc>
+        <w:tc>
+          <w:tcPr>
+            <w:tcW w:type="dxa" w:w="5903"/>
+            <w:tcMar>
+              <w:top w:w="90" w:type="dxa"/>
+              <w:start w:w="100" w:type="dxa"/>
+              <w:bottom w:w="90" w:type="dxa"/>
+              <w:end w:w="100" w:type="dxa"/>
+            </w:tcMar>
+            <w:shd w:fill="F8FAFC"/>
+            <w:vAlign w:val="center"/>
+          </w:tcPr>
+          <w:p>
+            <w:pPr>
+              <w:spacing w:after="0"/>
+            </w:pPr>
+            <w:r>
+              <w:rPr>
+                <w:rFonts w:ascii="Microsoft YaHei" w:hAnsi="Microsoft YaHei" w:eastAsia="Microsoft YaHei"/>
+                <w:sz w:val="16"/>
+              </w:rPr>
+              <w:t>Linux 使用 start.sh、systemctl 或 Bash 命令</w:t>
+            </w:r>
+          </w:p>
+        </w:tc>
+      </w:tr>
+      <w:tr>
+        <w:tc>
+          <w:tcPr>
+            <w:tcW w:type="dxa" w:w="2592"/>
+            <w:tcMar>
+              <w:top w:w="90" w:type="dxa"/>
+              <w:start w:w="100" w:type="dxa"/>
+              <w:bottom w:w="90" w:type="dxa"/>
+              <w:end w:w="100" w:type="dxa"/>
+            </w:tcMar>
+            <w:vAlign w:val="center"/>
+          </w:tcPr>
+          <w:p>
+            <w:pPr>
+              <w:spacing w:after="0"/>
+            </w:pPr>
+            <w:r>
+              <w:rPr>
+                <w:rFonts w:ascii="Microsoft YaHei" w:hAnsi="Microsoft YaHei" w:eastAsia="Microsoft YaHei"/>
+                <w:sz w:val="16"/>
+              </w:rPr>
+              <w:t>Windows 测试图片路径</w:t>
+            </w:r>
+          </w:p>
+        </w:tc>
+        <w:tc>
+          <w:tcPr>
+            <w:tcW w:type="dxa" w:w="1872"/>
+            <w:tcMar>
+              <w:top w:w="90" w:type="dxa"/>
+              <w:start w:w="100" w:type="dxa"/>
+              <w:bottom w:w="90" w:type="dxa"/>
+              <w:end w:w="100" w:type="dxa"/>
+            </w:tcMar>
+            <w:vAlign w:val="center"/>
+          </w:tcPr>
+          <w:p>
+            <w:pPr>
+              <w:spacing w:after="0"/>
+            </w:pPr>
+            <w:r>
+              <w:rPr>
+                <w:rFonts w:ascii="Microsoft YaHei" w:hAnsi="Microsoft YaHei" w:eastAsia="Microsoft YaHei"/>
+                <w:sz w:val="16"/>
+              </w:rPr>
+              <w:t>需修改</w:t>
+            </w:r>
+          </w:p>
+        </w:tc>
+        <w:tc>
+          <w:tcPr>
+            <w:tcW w:type="dxa" w:w="5903"/>
+            <w:tcMar>
+              <w:top w:w="90" w:type="dxa"/>
+              <w:start w:w="100" w:type="dxa"/>
+              <w:bottom w:w="90" w:type="dxa"/>
+              <w:end w:w="100" w:type="dxa"/>
+            </w:tcMar>
+            <w:vAlign w:val="center"/>
+          </w:tcPr>
+          <w:p>
+            <w:pPr>
+              <w:spacing w:after="0"/>
+            </w:pPr>
+            <w:r>
+              <w:rPr>
+                <w:rFonts w:ascii="Microsoft YaHei" w:hAnsi="Microsoft YaHei" w:eastAsia="Microsoft YaHei"/>
+                <w:sz w:val="16"/>
+              </w:rPr>
+              <w:t>改为 /data/vision-images/... 等 Linux 路径</w:t>
+            </w:r>
+          </w:p>
+        </w:tc>
+      </w:tr>
+    </w:tbl>
+    <w:p>
+      <w:pPr>
+        <w:spacing w:after="0"/>
+      </w:pPr>
+    </w:p>
+    <w:p>
+      <w:pPr>
+        <w:spacing w:before="80" w:after="140"/>
+        <w:ind w:left="198"/>
+        <w:shd w:fill="FFF4CE"/>
+        <w:pBdr>
+          <w:left w:val="single" w:sz="24" w:space="6" w:color="9A6700"/>
+        </w:pBdr>
+      </w:pPr>
+      <w:r>
+        <w:rPr>
+          <w:rFonts w:ascii="Microsoft YaHei" w:hAnsi="Microsoft YaHei" w:eastAsia="Microsoft YaHei"/>
+          <w:b/>
+          <w:color w:val="9A6700"/>
+          <w:sz w:val="18"/>
+        </w:rPr>
+        <w:t xml:space="preserve">系统 Python  </w:t>
+      </w:r>
+      <w:r>
+        <w:rPr>
+          <w:rFonts w:ascii="Microsoft YaHei" w:hAnsi="Microsoft YaHei" w:eastAsia="Microsoft YaHei"/>
+          <w:sz w:val="18"/>
+        </w:rPr>
+        <w:t>RHEL 8.3 自带 Python 版本不作为本项目运行环境。请通过企业内部 RPM、离线安装包、Conda 或源码方式准备独立 Python 3.11，不要替换系统 Python。</w:t>
+      </w:r>
+    </w:p>
+    <w:p>
+      <w:pPr>
+        <w:pStyle w:val="Heading2"/>
+        <w:keepNext/>
+      </w:pPr>
+      <w:r>
+        <w:t>A.2 推荐目录与账号</w:t>
+      </w:r>
+    </w:p>
+    <w:p>
+      <w:pPr>
+        <w:pStyle w:val="CodeBlock"/>
+        <w:keepLines/>
+      </w:pPr>
+      <w:r>
+        <w:rPr>
+          <w:rFonts w:ascii="Consolas" w:hAnsi="Consolas" w:eastAsia="Consolas"/>
+          <w:sz w:val="16"/>
+        </w:rPr>
+        <w:t>/opt/vision-platform/          # 程序、配置和虚拟环境</w:t>
+        <w:br/>
+        <w:t>/opt/vision-platform/vision-models/</w:t>
+        <w:br/>
+        <w:t>/data/vision-images/           # 相机原图共享目录</w:t>
+        <w:br/>
+        <w:t>/data/vision-results/          # 检测结果目录</w:t>
+        <w:br/>
+        <w:t>/var/log/vision-platform/      # 可选的系统日志目录</w:t>
+        <w:br/>
+        <w:t>运行账号：vision（禁止直接使用 root 长期运行）</w:t>
+      </w:r>
+    </w:p>
+    <w:p>
+      <w:pPr>
+        <w:pStyle w:val="CodeBlock"/>
+        <w:keepLines/>
+      </w:pPr>
+      <w:r>
+        <w:rPr>
+          <w:rFonts w:ascii="Consolas" w:hAnsi="Consolas" w:eastAsia="Consolas"/>
+          <w:sz w:val="16"/>
+        </w:rPr>
+        <w:t>sudo useradd --system --create-home --shell /sbin/nologin vision</w:t>
+        <w:br/>
+        <w:t>sudo mkdir -p /opt/vision-platform /data/vision-images /data/vision-results</w:t>
+        <w:br/>
+        <w:t>sudo chown -R vision:vision /opt/vision-platform /data/vision-images /data/vision-results</w:t>
+      </w:r>
+    </w:p>
+    <w:p>
+      <w:pPr>
+        <w:pStyle w:val="Heading2"/>
+        <w:keepNext/>
+      </w:pPr>
+      <w:r>
+        <w:t>A.3 基础依赖与虚拟环境</w:t>
+      </w:r>
+    </w:p>
+    <w:p>
+      <w:pPr>
+        <w:pStyle w:val="CodeBlock"/>
+        <w:keepLines/>
+      </w:pPr>
+      <w:r>
+        <w:rPr>
+          <w:rFonts w:ascii="Consolas" w:hAnsi="Consolas" w:eastAsia="Consolas"/>
+          <w:sz w:val="16"/>
+        </w:rPr>
+        <w:t>sudo dnf install -y gcc gcc-c++ make git curl wget \</w:t>
+        <w:br/>
+        <w:t xml:space="preserve">  openssl-devel bzip2-devel libffi-devel zlib-devel xz-devel sqlite-devel</w:t>
+        <w:br/>
+        <w:br/>
+        <w:t>cd /opt/vision-platform</w:t>
+        <w:br/>
+        <w:t>python3.11 -m venv .venv</w:t>
+        <w:br/>
+        <w:t>python3.11 -m venv .venv-qwen</w:t>
+        <w:br/>
+        <w:t>python3.11 -m venv ocr_service/.venv</w:t>
+        <w:br/>
+        <w:t>./.venv/bin/python -m pip install --upgrade pip</w:t>
+        <w:br/>
+        <w:t>./.venv/bin/python -m pip install -r requirements.txt</w:t>
+      </w:r>
+    </w:p>
+    <w:p>
+      <w:r>
+        <w:t>模型环境必须分别安装 Linux 版依赖。PyTorch、PaddlePaddle、bitsandbytes 的版本应与服务器 NVIDIA 驱动和 CUDA 运行时匹配，不能照搬 Windows wheel。</w:t>
+      </w:r>
+    </w:p>
+    <w:p>
+      <w:pPr>
+        <w:pStyle w:val="Heading2"/>
+        <w:keepNext/>
+      </w:pPr>
+      <w:r>
+        <w:t>A.4 RHEL 8.3 环境配置</w:t>
+      </w:r>
+    </w:p>
+    <w:p>
+      <w:pPr>
+        <w:pStyle w:val="CodeBlock"/>
+        <w:keepLines/>
+      </w:pPr>
+      <w:r>
+        <w:rPr>
+          <w:rFonts w:ascii="Consolas" w:hAnsi="Consolas" w:eastAsia="Consolas"/>
+          <w:sz w:val="16"/>
+        </w:rPr>
+        <w:t>APP_HOST=0.0.0.0</w:t>
+        <w:br/>
+        <w:t>APP_PORT=9011</w:t>
+        <w:br/>
+        <w:t>DATABASE_URL=sqlite:////opt/vision-platform/data/vision_platform.db</w:t>
+        <w:br/>
+        <w:t>GROUNDING_SERVICE_URL=http://127.0.0.1:9021</w:t>
+        <w:br/>
+        <w:t>DINOV2_SERVICE_URL=http://127.0.0.1:9022</w:t>
+        <w:br/>
+        <w:t>QWEN_VL_SERVICE_URL=http://127.0.0.1:9023</w:t>
+        <w:br/>
+        <w:t>PADDLEOCR_SERVICE_URL=http://127.0.0.1:9024</w:t>
+        <w:br/>
+        <w:t>SAM2_SERVICE_URL=http://127.0.0.1:9025</w:t>
+        <w:br/>
+        <w:t>DINO_MODEL_PATH=/opt/vision-platform/vision-models/dinov2-base</w:t>
+        <w:br/>
+        <w:t>QWEN_VL_MODEL_PATH=/opt/vision-platform/vision-models/qwen3-vl-4b-instruct</w:t>
+        <w:br/>
+        <w:t>SAM2_MODEL_PATH=/opt/vision-platform/vision-models/sam2.1-hiera-small/sam2.1_hiera_small.pt</w:t>
+      </w:r>
+    </w:p>
+    <w:p>
+      <w:pPr>
+        <w:spacing w:before="80" w:after="140"/>
+        <w:ind w:left="198"/>
+        <w:shd w:fill="EAF2F8"/>
+        <w:pBdr>
+          <w:left w:val="single" w:sz="24" w:space="6" w:color="17365D"/>
+        </w:pBdr>
+      </w:pPr>
+      <w:r>
+        <w:rPr>
+          <w:rFonts w:ascii="Microsoft YaHei" w:hAnsi="Microsoft YaHei" w:eastAsia="Microsoft YaHei"/>
+          <w:b/>
+          <w:color w:val="17365D"/>
+          <w:sz w:val="18"/>
+        </w:rPr>
+        <w:t xml:space="preserve">共享路径  </w:t>
+      </w:r>
+      <w:r>
+        <w:rPr>
+          <w:rFonts w:ascii="Microsoft YaHei" w:hAnsi="Microsoft YaHei" w:eastAsia="Microsoft YaHei"/>
+          <w:sz w:val="18"/>
+        </w:rPr>
+        <w:t>相机软件、平台和模型服务必须看到同一张图片的同一 Linux 路径。建议统一挂载为 /data/vision-images，并在配方和接口中只使用该内部路径。</w:t>
+      </w:r>
+    </w:p>
+    <w:p>
+      <w:r>
+        <w:br w:type="page"/>
+      </w:r>
+    </w:p>
+    <w:p>
+      <w:pPr>
+        <w:pStyle w:val="Heading2"/>
+        <w:keepNext/>
+      </w:pPr>
+      <w:r>
+        <w:t>A.5 Linux 启动与 systemd 管理</w:t>
+      </w:r>
+    </w:p>
+    <w:p>
+      <w:pPr>
+        <w:pStyle w:val="Heading3"/>
+        <w:keepNext/>
+      </w:pPr>
+      <w:r>
+        <w:t>A.5.1 开发/验证启动</w:t>
+      </w:r>
+    </w:p>
+    <w:p>
+      <w:pPr>
+        <w:pStyle w:val="CodeBlock"/>
+        <w:keepLines/>
+      </w:pPr>
+      <w:r>
+        <w:rPr>
+          <w:rFonts w:ascii="Consolas" w:hAnsi="Consolas" w:eastAsia="Consolas"/>
+          <w:sz w:val="16"/>
+        </w:rPr>
+        <w:t>cd /opt/vision-platform</w:t>
+        <w:br/>
+        <w:t>chmod +x start.sh</w:t>
+        <w:br/>
+        <w:t>./start.sh</w:t>
+      </w:r>
+    </w:p>
+    <w:p>
+      <w:r>
+        <w:t>模型服务可使用 scripts/run_*.py 验证启动，但生产服务器建议每个模型独立配置 systemd 服务。</w:t>
+      </w:r>
+    </w:p>
+    <w:p>
+      <w:pPr>
+        <w:pStyle w:val="Heading3"/>
+        <w:keepNext/>
+      </w:pPr>
+      <w:r>
+        <w:t>A.5.2 主平台 systemd 示例</w:t>
+      </w:r>
+    </w:p>
+    <w:p>
+      <w:pPr>
+        <w:pStyle w:val="CodeBlock"/>
+        <w:keepLines/>
+      </w:pPr>
+      <w:r>
+        <w:rPr>
+          <w:rFonts w:ascii="Consolas" w:hAnsi="Consolas" w:eastAsia="Consolas"/>
+          <w:sz w:val="16"/>
+        </w:rPr>
+        <w:t># /etc/systemd/system/vision-platform.service</w:t>
+        <w:br/>
+        <w:t>[Unit]</w:t>
+        <w:br/>
+        <w:t>Description=Vision Platform</w:t>
+        <w:br/>
+        <w:t>After=network-online.target</w:t>
+        <w:br/>
+        <w:t>Wants=network-online.target</w:t>
+        <w:br/>
+        <w:br/>
+        <w:t>[Service]</w:t>
+        <w:br/>
+        <w:t>Type=simple</w:t>
+        <w:br/>
+        <w:t>User=vision</w:t>
+        <w:br/>
+        <w:t>Group=vision</w:t>
+        <w:br/>
+        <w:t>WorkingDirectory=/opt/vision-platform</w:t>
+        <w:br/>
+        <w:t>EnvironmentFile=/opt/vision-platform/.env</w:t>
+        <w:br/>
+        <w:t>ExecStart=/opt/vision-platform/.venv/bin/python -m uvicorn app.main:app --host 0.0.0.0 --port 9011 --workers 1</w:t>
+        <w:br/>
+        <w:t>Restart=always</w:t>
+        <w:br/>
+        <w:t>RestartSec=5</w:t>
+        <w:br/>
+        <w:t>TimeoutStopSec=30</w:t>
+        <w:br/>
+        <w:t>LimitNOFILE=65535</w:t>
+        <w:br/>
+        <w:br/>
+        <w:t>[Install]</w:t>
+        <w:br/>
+        <w:t>WantedBy=multi-user.target</w:t>
+      </w:r>
+    </w:p>
+    <w:p>
+      <w:pPr>
+        <w:pStyle w:val="CodeBlock"/>
+        <w:keepLines/>
+      </w:pPr>
+      <w:r>
+        <w:rPr>
+          <w:rFonts w:ascii="Consolas" w:hAnsi="Consolas" w:eastAsia="Consolas"/>
+          <w:sz w:val="16"/>
+        </w:rPr>
+        <w:t>sudo systemctl daemon-reload</w:t>
+        <w:br/>
+        <w:t>sudo systemctl enable --now vision-platform</w:t>
+        <w:br/>
+        <w:t>sudo systemctl status vision-platform</w:t>
+        <w:br/>
+        <w:t>sudo journalctl -u vision-platform -f</w:t>
+      </w:r>
+    </w:p>
+    <w:p>
+      <w:pPr>
+        <w:pStyle w:val="Heading3"/>
+        <w:keepNext/>
+      </w:pPr>
+      <w:r>
+        <w:t>A.5.3 模型服务 systemd 原则</w:t>
+      </w:r>
+    </w:p>
+    <w:p>
+      <w:pPr>
+        <w:pStyle w:val="ListBullet"/>
+        <w:keepNext w:val="0"/>
+      </w:pPr>
+      <w:r>
+        <w:rPr>
+          <w:rFonts w:ascii="Microsoft YaHei" w:hAnsi="Microsoft YaHei" w:eastAsia="Microsoft YaHei"/>
+          <w:sz w:val="18"/>
+        </w:rPr>
+        <w:t>DINOv2、Grounding DINO、Qwen3-VL、PaddleOCR、SAM2 分别建立独立 unit。</w:t>
+      </w:r>
+    </w:p>
+    <w:p>
+      <w:pPr>
+        <w:pStyle w:val="ListBullet"/>
+        <w:keepNext w:val="0"/>
+      </w:pPr>
+      <w:r>
+        <w:rPr>
+          <w:rFonts w:ascii="Microsoft YaHei" w:hAnsi="Microsoft YaHei" w:eastAsia="Microsoft YaHei"/>
+          <w:sz w:val="18"/>
+        </w:rPr>
+        <w:t>每个 unit 的 ExecStart 指向对应虚拟环境和 scripts/run_*.py。</w:t>
+      </w:r>
+    </w:p>
+    <w:p>
+      <w:pPr>
+        <w:pStyle w:val="ListBullet"/>
+        <w:keepNext w:val="0"/>
+      </w:pPr>
+      <w:r>
+        <w:rPr>
+          <w:rFonts w:ascii="Microsoft YaHei" w:hAnsi="Microsoft YaHei" w:eastAsia="Microsoft YaHei"/>
+          <w:sz w:val="18"/>
+        </w:rPr>
+        <w:t>GPU 模型保持单进程；不要配置多 worker 重复加载权重。</w:t>
+      </w:r>
+    </w:p>
+    <w:p>
+      <w:pPr>
+        <w:pStyle w:val="ListBullet"/>
+        <w:keepNext w:val="0"/>
+      </w:pPr>
+      <w:r>
+        <w:rPr>
+          <w:rFonts w:ascii="Microsoft YaHei" w:hAnsi="Microsoft YaHei" w:eastAsia="Microsoft YaHei"/>
+          <w:sz w:val="18"/>
+        </w:rPr>
+        <w:t>设置 Restart=on-failure，并用 systemctl 负责启停和自动拉起。</w:t>
+      </w:r>
+    </w:p>
+    <w:p>
+      <w:pPr>
+        <w:pStyle w:val="ListBullet"/>
+        <w:keepNext w:val="0"/>
+      </w:pPr>
+      <w:r>
+        <w:rPr>
+          <w:rFonts w:ascii="Microsoft YaHei" w:hAnsi="Microsoft YaHei" w:eastAsia="Microsoft YaHei"/>
+          <w:sz w:val="18"/>
+        </w:rPr>
+        <w:t>生产模式下，平台页面主要用于查看状态和日志；服务生命周期以 systemd 为准。</w:t>
+      </w:r>
+    </w:p>
+    <w:p>
+      <w:pPr>
+        <w:pStyle w:val="Heading2"/>
+        <w:keepNext/>
+      </w:pPr>
+      <w:r>
+        <w:t>A.6 SELinux、防火墙与权限</w:t>
+      </w:r>
+    </w:p>
+    <w:p>
+      <w:pPr>
+        <w:pStyle w:val="ListBullet"/>
+        <w:keepNext w:val="0"/>
+      </w:pPr>
+      <w:r>
+        <w:rPr>
+          <w:rFonts w:ascii="Microsoft YaHei" w:hAnsi="Microsoft YaHei" w:eastAsia="Microsoft YaHei"/>
+          <w:sz w:val="18"/>
+        </w:rPr>
+        <w:t>保持 SELinux Enforcing，不建议通过 setenforce 0 规避权限问题。</w:t>
+      </w:r>
+    </w:p>
+    <w:p>
+      <w:pPr>
+        <w:pStyle w:val="ListBullet"/>
+        <w:keepNext w:val="0"/>
+      </w:pPr>
+      <w:r>
+        <w:rPr>
+          <w:rFonts w:ascii="Microsoft YaHei" w:hAnsi="Microsoft YaHei" w:eastAsia="Microsoft YaHei"/>
+          <w:sz w:val="18"/>
+        </w:rPr>
+        <w:t>只对外开放平台端口 9011；9021—9025 建议仅监听 127.0.0.1。</w:t>
+      </w:r>
+    </w:p>
+    <w:p>
+      <w:pPr>
+        <w:pStyle w:val="ListBullet"/>
+        <w:keepNext w:val="0"/>
+      </w:pPr>
+      <w:r>
+        <w:rPr>
+          <w:rFonts w:ascii="Microsoft YaHei" w:hAnsi="Microsoft YaHei" w:eastAsia="Microsoft YaHei"/>
+          <w:sz w:val="18"/>
+        </w:rPr>
+        <w:t>确保 vision 账号对 data、uploads、detection_results、embeddings 和 logs 具有读写权限。</w:t>
+      </w:r>
+    </w:p>
+    <w:p>
+      <w:pPr>
+        <w:pStyle w:val="ListBullet"/>
+        <w:keepNext w:val="0"/>
+      </w:pPr>
+      <w:r>
+        <w:rPr>
+          <w:rFonts w:ascii="Microsoft YaHei" w:hAnsi="Microsoft YaHei" w:eastAsia="Microsoft YaHei"/>
+          <w:sz w:val="18"/>
+        </w:rPr>
+        <w:t>若图片来自 NFS/NAS，按企业安全策略配置挂载权限和 SELinux 文件上下文。</w:t>
+      </w:r>
+    </w:p>
+    <w:p>
+      <w:pPr>
+        <w:pStyle w:val="CodeBlock"/>
+        <w:keepLines/>
+      </w:pPr>
+      <w:r>
+        <w:rPr>
+          <w:rFonts w:ascii="Consolas" w:hAnsi="Consolas" w:eastAsia="Consolas"/>
+          <w:sz w:val="16"/>
+        </w:rPr>
+        <w:t>sudo firewall-cmd --permanent --add-port=9011/tcp</w:t>
+        <w:br/>
+        <w:t>sudo firewall-cmd --reload</w:t>
+        <w:br/>
+        <w:t>sudo restorecon -Rv /opt/vision-platform /data/vision-images /data/vision-results</w:t>
+      </w:r>
+    </w:p>
+    <w:p>
+      <w:pPr>
+        <w:pStyle w:val="Heading2"/>
+        <w:keepNext/>
+      </w:pPr>
+      <w:r>
+        <w:t>A.7 RHEL 8.3 上线检查</w:t>
+      </w:r>
+    </w:p>
+    <w:tbl>
+      <w:tblPr>
+        <w:tblStyle w:val="TableGrid"/>
+        <w:tblW w:type="auto" w:w="0"/>
+        <w:jc w:val="center"/>
+        <w:tblLayout w:type="fixed"/>
+        <w:tblLook w:firstColumn="1" w:firstRow="1" w:lastColumn="0" w:lastRow="0" w:noHBand="0" w:noVBand="1" w:val="04A0"/>
+      </w:tblPr>
+      <w:tblGrid>
+        <w:gridCol w:w="3293"/>
+        <w:gridCol w:w="3293"/>
+        <w:gridCol w:w="3293"/>
+      </w:tblGrid>
+      <w:tr>
+        <w:trPr>
+          <w:tblHeader w:val="true"/>
+        </w:trPr>
+        <w:tc>
+          <w:tcPr>
+            <w:tcW w:type="dxa" w:w="936"/>
+            <w:shd w:fill="17365D"/>
+            <w:vAlign w:val="center"/>
+            <w:tcMar>
+              <w:top w:w="90" w:type="dxa"/>
+              <w:start w:w="100" w:type="dxa"/>
+              <w:bottom w:w="90" w:type="dxa"/>
+              <w:end w:w="100" w:type="dxa"/>
+            </w:tcMar>
+          </w:tcPr>
+          <w:p>
+            <w:pPr>
+              <w:jc w:val="center"/>
+            </w:pPr>
+            <w:r>
+              <w:rPr>
+                <w:rFonts w:ascii="Microsoft YaHei" w:hAnsi="Microsoft YaHei" w:eastAsia="Microsoft YaHei"/>
+                <w:b/>
+                <w:color w:val="FFFFFF"/>
+                <w:sz w:val="17"/>
+              </w:rPr>
+              <w:t>序号</w:t>
+            </w:r>
+          </w:p>
+        </w:tc>
+        <w:tc>
+          <w:tcPr>
+            <w:tcW w:type="dxa" w:w="7992"/>
+            <w:shd w:fill="17365D"/>
+            <w:vAlign w:val="center"/>
+            <w:tcMar>
+              <w:top w:w="90" w:type="dxa"/>
+              <w:start w:w="100" w:type="dxa"/>
+              <w:bottom w:w="90" w:type="dxa"/>
+              <w:end w:w="100" w:type="dxa"/>
+            </w:tcMar>
+          </w:tcPr>
+          <w:p>
+            <w:pPr>
+              <w:jc w:val="center"/>
+            </w:pPr>
+            <w:r>
+              <w:rPr>
+                <w:rFonts w:ascii="Microsoft YaHei" w:hAnsi="Microsoft YaHei" w:eastAsia="Microsoft YaHei"/>
+                <w:b/>
+                <w:color w:val="FFFFFF"/>
+                <w:sz w:val="17"/>
+              </w:rPr>
+              <w:t>检查项</w:t>
+            </w:r>
+          </w:p>
+        </w:tc>
+        <w:tc>
+          <w:tcPr>
+            <w:tcW w:type="dxa" w:w="2088"/>
+            <w:shd w:fill="17365D"/>
+            <w:vAlign w:val="center"/>
+            <w:tcMar>
+              <w:top w:w="90" w:type="dxa"/>
+              <w:start w:w="100" w:type="dxa"/>
+              <w:bottom w:w="90" w:type="dxa"/>
+              <w:end w:w="100" w:type="dxa"/>
+            </w:tcMar>
+          </w:tcPr>
+          <w:p>
+            <w:pPr>
+              <w:jc w:val="center"/>
+            </w:pPr>
+            <w:r>
+              <w:rPr>
+                <w:rFonts w:ascii="Microsoft YaHei" w:hAnsi="Microsoft YaHei" w:eastAsia="Microsoft YaHei"/>
+                <w:b/>
+                <w:color w:val="FFFFFF"/>
+                <w:sz w:val="17"/>
+              </w:rPr>
+              <w:t>结果</w:t>
+            </w:r>
+          </w:p>
+        </w:tc>
+      </w:tr>
+      <w:tr>
+        <w:tc>
+          <w:tcPr>
+            <w:tcW w:type="dxa" w:w="936"/>
+            <w:tcMar>
+              <w:top w:w="90" w:type="dxa"/>
+              <w:start w:w="100" w:type="dxa"/>
+              <w:bottom w:w="90" w:type="dxa"/>
+              <w:end w:w="100" w:type="dxa"/>
+            </w:tcMar>
+            <w:vAlign w:val="center"/>
+          </w:tcPr>
+          <w:p>
+            <w:pPr>
+              <w:spacing w:after="0"/>
+            </w:pPr>
+            <w:r>
+              <w:rPr>
+                <w:rFonts w:ascii="Microsoft YaHei" w:hAnsi="Microsoft YaHei" w:eastAsia="Microsoft YaHei"/>
+                <w:sz w:val="16"/>
+              </w:rPr>
+              <w:t>1</w:t>
+            </w:r>
+          </w:p>
+        </w:tc>
+        <w:tc>
+          <w:tcPr>
+            <w:tcW w:type="dxa" w:w="7992"/>
+            <w:tcMar>
+              <w:top w:w="90" w:type="dxa"/>
+              <w:start w:w="100" w:type="dxa"/>
+              <w:bottom w:w="90" w:type="dxa"/>
+              <w:end w:w="100" w:type="dxa"/>
+            </w:tcMar>
+            <w:vAlign w:val="center"/>
+          </w:tcPr>
+          <w:p>
+            <w:pPr>
+              <w:spacing w:after="0"/>
+            </w:pPr>
+            <w:r>
+              <w:rPr>
+                <w:rFonts w:ascii="Microsoft YaHei" w:hAnsi="Microsoft YaHei" w:eastAsia="Microsoft YaHei"/>
+                <w:sz w:val="16"/>
+              </w:rPr>
+              <w:t>uname -m 为 x86_64，Python 为 3.11.x</w:t>
+            </w:r>
+          </w:p>
+        </w:tc>
+        <w:tc>
+          <w:tcPr>
+            <w:tcW w:type="dxa" w:w="2088"/>
+            <w:tcMar>
+              <w:top w:w="90" w:type="dxa"/>
+              <w:start w:w="100" w:type="dxa"/>
+              <w:bottom w:w="90" w:type="dxa"/>
+              <w:end w:w="100" w:type="dxa"/>
+            </w:tcMar>
+            <w:vAlign w:val="center"/>
+          </w:tcPr>
+          <w:p>
+            <w:pPr>
+              <w:spacing w:after="0"/>
+            </w:pPr>
+            <w:r>
+              <w:rPr>
+                <w:rFonts w:ascii="Microsoft YaHei" w:hAnsi="Microsoft YaHei" w:eastAsia="Microsoft YaHei"/>
+                <w:sz w:val="16"/>
+              </w:rPr>
+              <w:t>□ 通过</w:t>
+            </w:r>
+          </w:p>
+        </w:tc>
+      </w:tr>
+      <w:tr>
+        <w:tc>
+          <w:tcPr>
+            <w:tcW w:type="dxa" w:w="936"/>
+            <w:tcMar>
+              <w:top w:w="90" w:type="dxa"/>
+              <w:start w:w="100" w:type="dxa"/>
+              <w:bottom w:w="90" w:type="dxa"/>
+              <w:end w:w="100" w:type="dxa"/>
+            </w:tcMar>
+            <w:shd w:fill="F8FAFC"/>
+            <w:vAlign w:val="center"/>
+          </w:tcPr>
+          <w:p>
+            <w:pPr>
+              <w:spacing w:after="0"/>
+            </w:pPr>
+            <w:r>
+              <w:rPr>
+                <w:rFonts w:ascii="Microsoft YaHei" w:hAnsi="Microsoft YaHei" w:eastAsia="Microsoft YaHei"/>
+                <w:sz w:val="16"/>
+              </w:rPr>
+              <w:t>2</w:t>
+            </w:r>
+          </w:p>
+        </w:tc>
+        <w:tc>
+          <w:tcPr>
+            <w:tcW w:type="dxa" w:w="7992"/>
+            <w:tcMar>
+              <w:top w:w="90" w:type="dxa"/>
+              <w:start w:w="100" w:type="dxa"/>
+              <w:bottom w:w="90" w:type="dxa"/>
+              <w:end w:w="100" w:type="dxa"/>
+            </w:tcMar>
+            <w:shd w:fill="F8FAFC"/>
+            <w:vAlign w:val="center"/>
+          </w:tcPr>
+          <w:p>
+            <w:pPr>
+              <w:spacing w:after="0"/>
+            </w:pPr>
+            <w:r>
+              <w:rPr>
+                <w:rFonts w:ascii="Microsoft YaHei" w:hAnsi="Microsoft YaHei" w:eastAsia="Microsoft YaHei"/>
+                <w:sz w:val="16"/>
+              </w:rPr>
+              <w:t>nvidia-smi 正常，驱动/CUDA 与模型依赖匹配</w:t>
+            </w:r>
+          </w:p>
+        </w:tc>
+        <w:tc>
+          <w:tcPr>
+            <w:tcW w:type="dxa" w:w="2088"/>
+            <w:tcMar>
+              <w:top w:w="90" w:type="dxa"/>
+              <w:start w:w="100" w:type="dxa"/>
+              <w:bottom w:w="90" w:type="dxa"/>
+              <w:end w:w="100" w:type="dxa"/>
+            </w:tcMar>
+            <w:shd w:fill="F8FAFC"/>
+            <w:vAlign w:val="center"/>
+          </w:tcPr>
+          <w:p>
+            <w:pPr>
+              <w:spacing w:after="0"/>
+            </w:pPr>
+            <w:r>
+              <w:rPr>
+                <w:rFonts w:ascii="Microsoft YaHei" w:hAnsi="Microsoft YaHei" w:eastAsia="Microsoft YaHei"/>
+                <w:sz w:val="16"/>
+              </w:rPr>
+              <w:t>□ 通过</w:t>
+            </w:r>
+          </w:p>
+        </w:tc>
+      </w:tr>
+      <w:tr>
+        <w:tc>
+          <w:tcPr>
+            <w:tcW w:type="dxa" w:w="936"/>
+            <w:tcMar>
+              <w:top w:w="90" w:type="dxa"/>
+              <w:start w:w="100" w:type="dxa"/>
+              <w:bottom w:w="90" w:type="dxa"/>
+              <w:end w:w="100" w:type="dxa"/>
+            </w:tcMar>
+            <w:vAlign w:val="center"/>
+          </w:tcPr>
+          <w:p>
+            <w:pPr>
+              <w:spacing w:after="0"/>
+            </w:pPr>
+            <w:r>
+              <w:rPr>
+                <w:rFonts w:ascii="Microsoft YaHei" w:hAnsi="Microsoft YaHei" w:eastAsia="Microsoft YaHei"/>
+                <w:sz w:val="16"/>
+              </w:rPr>
+              <w:t>3</w:t>
+            </w:r>
+          </w:p>
+        </w:tc>
+        <w:tc>
+          <w:tcPr>
+            <w:tcW w:type="dxa" w:w="7992"/>
+            <w:tcMar>
+              <w:top w:w="90" w:type="dxa"/>
+              <w:start w:w="100" w:type="dxa"/>
+              <w:bottom w:w="90" w:type="dxa"/>
+              <w:end w:w="100" w:type="dxa"/>
+            </w:tcMar>
+            <w:vAlign w:val="center"/>
+          </w:tcPr>
+          <w:p>
+            <w:pPr>
+              <w:spacing w:after="0"/>
+            </w:pPr>
+            <w:r>
+              <w:rPr>
+                <w:rFonts w:ascii="Microsoft YaHei" w:hAnsi="Microsoft YaHei" w:eastAsia="Microsoft YaHei"/>
+                <w:sz w:val="16"/>
+              </w:rPr>
+              <w:t>所有模型使用 Linux 虚拟环境，未复制 Windows .venv</w:t>
+            </w:r>
+          </w:p>
+        </w:tc>
+        <w:tc>
+          <w:tcPr>
+            <w:tcW w:type="dxa" w:w="2088"/>
+            <w:tcMar>
+              <w:top w:w="90" w:type="dxa"/>
+              <w:start w:w="100" w:type="dxa"/>
+              <w:bottom w:w="90" w:type="dxa"/>
+              <w:end w:w="100" w:type="dxa"/>
+            </w:tcMar>
+            <w:vAlign w:val="center"/>
+          </w:tcPr>
+          <w:p>
+            <w:pPr>
+              <w:spacing w:after="0"/>
+            </w:pPr>
+            <w:r>
+              <w:rPr>
+                <w:rFonts w:ascii="Microsoft YaHei" w:hAnsi="Microsoft YaHei" w:eastAsia="Microsoft YaHei"/>
+                <w:sz w:val="16"/>
+              </w:rPr>
+              <w:t>□ 通过</w:t>
+            </w:r>
+          </w:p>
+        </w:tc>
+      </w:tr>
+      <w:tr>
+        <w:tc>
+          <w:tcPr>
+            <w:tcW w:type="dxa" w:w="936"/>
+            <w:tcMar>
+              <w:top w:w="90" w:type="dxa"/>
+              <w:start w:w="100" w:type="dxa"/>
+              <w:bottom w:w="90" w:type="dxa"/>
+              <w:end w:w="100" w:type="dxa"/>
+            </w:tcMar>
+            <w:shd w:fill="F8FAFC"/>
+            <w:vAlign w:val="center"/>
+          </w:tcPr>
+          <w:p>
+            <w:pPr>
+              <w:spacing w:after="0"/>
+            </w:pPr>
+            <w:r>
+              <w:rPr>
+                <w:rFonts w:ascii="Microsoft YaHei" w:hAnsi="Microsoft YaHei" w:eastAsia="Microsoft YaHei"/>
+                <w:sz w:val="16"/>
+              </w:rPr>
+              <w:t>4</w:t>
+            </w:r>
+          </w:p>
+        </w:tc>
+        <w:tc>
+          <w:tcPr>
+            <w:tcW w:type="dxa" w:w="7992"/>
+            <w:tcMar>
+              <w:top w:w="90" w:type="dxa"/>
+              <w:start w:w="100" w:type="dxa"/>
+              <w:bottom w:w="90" w:type="dxa"/>
+              <w:end w:w="100" w:type="dxa"/>
+            </w:tcMar>
+            <w:shd w:fill="F8FAFC"/>
+            <w:vAlign w:val="center"/>
+          </w:tcPr>
+          <w:p>
+            <w:pPr>
+              <w:spacing w:after="0"/>
+            </w:pPr>
+            <w:r>
+              <w:rPr>
+                <w:rFonts w:ascii="Microsoft YaHei" w:hAnsi="Microsoft YaHei" w:eastAsia="Microsoft YaHei"/>
+                <w:sz w:val="16"/>
+              </w:rPr>
+              <w:t>平台和模型服务健康检查全部正常</w:t>
+            </w:r>
+          </w:p>
+        </w:tc>
+        <w:tc>
+          <w:tcPr>
+            <w:tcW w:type="dxa" w:w="2088"/>
+            <w:tcMar>
+              <w:top w:w="90" w:type="dxa"/>
+              <w:start w:w="100" w:type="dxa"/>
+              <w:bottom w:w="90" w:type="dxa"/>
+              <w:end w:w="100" w:type="dxa"/>
+            </w:tcMar>
+            <w:shd w:fill="F8FAFC"/>
+            <w:vAlign w:val="center"/>
+          </w:tcPr>
+          <w:p>
+            <w:pPr>
+              <w:spacing w:after="0"/>
+            </w:pPr>
+            <w:r>
+              <w:rPr>
+                <w:rFonts w:ascii="Microsoft YaHei" w:hAnsi="Microsoft YaHei" w:eastAsia="Microsoft YaHei"/>
+                <w:sz w:val="16"/>
+              </w:rPr>
+              <w:t>□ 通过</w:t>
+            </w:r>
+          </w:p>
+        </w:tc>
+      </w:tr>
+      <w:tr>
+        <w:tc>
+          <w:tcPr>
+            <w:tcW w:type="dxa" w:w="936"/>
+            <w:tcMar>
+              <w:top w:w="90" w:type="dxa"/>
+              <w:start w:w="100" w:type="dxa"/>
+              <w:bottom w:w="90" w:type="dxa"/>
+              <w:end w:w="100" w:type="dxa"/>
+            </w:tcMar>
+            <w:vAlign w:val="center"/>
+          </w:tcPr>
+          <w:p>
+            <w:pPr>
+              <w:spacing w:after="0"/>
+            </w:pPr>
+            <w:r>
+              <w:rPr>
+                <w:rFonts w:ascii="Microsoft YaHei" w:hAnsi="Microsoft YaHei" w:eastAsia="Microsoft YaHei"/>
+                <w:sz w:val="16"/>
+              </w:rPr>
+              <w:t>5</w:t>
+            </w:r>
+          </w:p>
+        </w:tc>
+        <w:tc>
+          <w:tcPr>
+            <w:tcW w:type="dxa" w:w="7992"/>
+            <w:tcMar>
+              <w:top w:w="90" w:type="dxa"/>
+              <w:start w:w="100" w:type="dxa"/>
+              <w:bottom w:w="90" w:type="dxa"/>
+              <w:end w:w="100" w:type="dxa"/>
+            </w:tcMar>
+            <w:vAlign w:val="center"/>
+          </w:tcPr>
+          <w:p>
+            <w:pPr>
+              <w:spacing w:after="0"/>
+            </w:pPr>
+            <w:r>
+              <w:rPr>
+                <w:rFonts w:ascii="Microsoft YaHei" w:hAnsi="Microsoft YaHei" w:eastAsia="Microsoft YaHei"/>
+                <w:sz w:val="16"/>
+              </w:rPr>
+              <w:t>共享图片路径在所有服务中一致且可读取</w:t>
+            </w:r>
+          </w:p>
+        </w:tc>
+        <w:tc>
+          <w:tcPr>
+            <w:tcW w:type="dxa" w:w="2088"/>
+            <w:tcMar>
+              <w:top w:w="90" w:type="dxa"/>
+              <w:start w:w="100" w:type="dxa"/>
+              <w:bottom w:w="90" w:type="dxa"/>
+              <w:end w:w="100" w:type="dxa"/>
+            </w:tcMar>
+            <w:vAlign w:val="center"/>
+          </w:tcPr>
+          <w:p>
+            <w:pPr>
+              <w:spacing w:after="0"/>
+            </w:pPr>
+            <w:r>
+              <w:rPr>
+                <w:rFonts w:ascii="Microsoft YaHei" w:hAnsi="Microsoft YaHei" w:eastAsia="Microsoft YaHei"/>
+                <w:sz w:val="16"/>
+              </w:rPr>
+              <w:t>□ 通过</w:t>
+            </w:r>
+          </w:p>
+        </w:tc>
+      </w:tr>
+      <w:tr>
+        <w:tc>
+          <w:tcPr>
+            <w:tcW w:type="dxa" w:w="936"/>
+            <w:tcMar>
+              <w:top w:w="90" w:type="dxa"/>
+              <w:start w:w="100" w:type="dxa"/>
+              <w:bottom w:w="90" w:type="dxa"/>
+              <w:end w:w="100" w:type="dxa"/>
+            </w:tcMar>
+            <w:shd w:fill="F8FAFC"/>
+            <w:vAlign w:val="center"/>
+          </w:tcPr>
+          <w:p>
+            <w:pPr>
+              <w:spacing w:after="0"/>
+            </w:pPr>
+            <w:r>
+              <w:rPr>
+                <w:rFonts w:ascii="Microsoft YaHei" w:hAnsi="Microsoft YaHei" w:eastAsia="Microsoft YaHei"/>
+                <w:sz w:val="16"/>
+              </w:rPr>
+              <w:t>6</w:t>
+            </w:r>
+          </w:p>
+        </w:tc>
+        <w:tc>
+          <w:tcPr>
+            <w:tcW w:type="dxa" w:w="7992"/>
+            <w:tcMar>
+              <w:top w:w="90" w:type="dxa"/>
+              <w:start w:w="100" w:type="dxa"/>
+              <w:bottom w:w="90" w:type="dxa"/>
+              <w:end w:w="100" w:type="dxa"/>
+            </w:tcMar>
+            <w:shd w:fill="F8FAFC"/>
+            <w:vAlign w:val="center"/>
+          </w:tcPr>
+          <w:p>
+            <w:pPr>
+              <w:spacing w:after="0"/>
+            </w:pPr>
+            <w:r>
+              <w:rPr>
+                <w:rFonts w:ascii="Microsoft YaHei" w:hAnsi="Microsoft YaHei" w:eastAsia="Microsoft YaHei"/>
+                <w:sz w:val="16"/>
+              </w:rPr>
+              <w:t>systemd 自动启动、停止和重启验证通过</w:t>
+            </w:r>
+          </w:p>
+        </w:tc>
+        <w:tc>
+          <w:tcPr>
+            <w:tcW w:type="dxa" w:w="2088"/>
+            <w:tcMar>
+              <w:top w:w="90" w:type="dxa"/>
+              <w:start w:w="100" w:type="dxa"/>
+              <w:bottom w:w="90" w:type="dxa"/>
+              <w:end w:w="100" w:type="dxa"/>
+            </w:tcMar>
+            <w:shd w:fill="F8FAFC"/>
+            <w:vAlign w:val="center"/>
+          </w:tcPr>
+          <w:p>
+            <w:pPr>
+              <w:spacing w:after="0"/>
+            </w:pPr>
+            <w:r>
+              <w:rPr>
+                <w:rFonts w:ascii="Microsoft YaHei" w:hAnsi="Microsoft YaHei" w:eastAsia="Microsoft YaHei"/>
+                <w:sz w:val="16"/>
+              </w:rPr>
+              <w:t>□ 通过</w:t>
+            </w:r>
+          </w:p>
+        </w:tc>
+      </w:tr>
+      <w:tr>
+        <w:tc>
+          <w:tcPr>
+            <w:tcW w:type="dxa" w:w="936"/>
+            <w:tcMar>
+              <w:top w:w="90" w:type="dxa"/>
+              <w:start w:w="100" w:type="dxa"/>
+              <w:bottom w:w="90" w:type="dxa"/>
+              <w:end w:w="100" w:type="dxa"/>
+            </w:tcMar>
+            <w:vAlign w:val="center"/>
+          </w:tcPr>
+          <w:p>
+            <w:pPr>
+              <w:spacing w:after="0"/>
+            </w:pPr>
+            <w:r>
+              <w:rPr>
+                <w:rFonts w:ascii="Microsoft YaHei" w:hAnsi="Microsoft YaHei" w:eastAsia="Microsoft YaHei"/>
+                <w:sz w:val="16"/>
+              </w:rPr>
+              <w:t>7</w:t>
+            </w:r>
+          </w:p>
+        </w:tc>
+        <w:tc>
+          <w:tcPr>
+            <w:tcW w:type="dxa" w:w="7992"/>
+            <w:tcMar>
+              <w:top w:w="90" w:type="dxa"/>
+              <w:start w:w="100" w:type="dxa"/>
+              <w:bottom w:w="90" w:type="dxa"/>
+              <w:end w:w="100" w:type="dxa"/>
+            </w:tcMar>
+            <w:vAlign w:val="center"/>
+          </w:tcPr>
+          <w:p>
+            <w:pPr>
+              <w:spacing w:after="0"/>
+            </w:pPr>
+            <w:r>
+              <w:rPr>
+                <w:rFonts w:ascii="Microsoft YaHei" w:hAnsi="Microsoft YaHei" w:eastAsia="Microsoft YaHei"/>
+                <w:sz w:val="16"/>
+              </w:rPr>
+              <w:t>SELinux 保持 Enforcing，防火墙仅开放必要端口</w:t>
+            </w:r>
+          </w:p>
+        </w:tc>
+        <w:tc>
+          <w:tcPr>
+            <w:tcW w:type="dxa" w:w="2088"/>
+            <w:tcMar>
+              <w:top w:w="90" w:type="dxa"/>
+              <w:start w:w="100" w:type="dxa"/>
+              <w:bottom w:w="90" w:type="dxa"/>
+              <w:end w:w="100" w:type="dxa"/>
+            </w:tcMar>
+            <w:vAlign w:val="center"/>
+          </w:tcPr>
+          <w:p>
+            <w:pPr>
+              <w:spacing w:after="0"/>
+            </w:pPr>
+            <w:r>
+              <w:rPr>
+                <w:rFonts w:ascii="Microsoft YaHei" w:hAnsi="Microsoft YaHei" w:eastAsia="Microsoft YaHei"/>
+                <w:sz w:val="16"/>
+              </w:rPr>
+              <w:t>□ 通过</w:t>
+            </w:r>
+          </w:p>
+        </w:tc>
+      </w:tr>
+      <w:tr>
+        <w:tc>
+          <w:tcPr>
+            <w:tcW w:type="dxa" w:w="936"/>
+            <w:tcMar>
+              <w:top w:w="90" w:type="dxa"/>
+              <w:start w:w="100" w:type="dxa"/>
+              <w:bottom w:w="90" w:type="dxa"/>
+              <w:end w:w="100" w:type="dxa"/>
+            </w:tcMar>
+            <w:shd w:fill="F8FAFC"/>
+            <w:vAlign w:val="center"/>
+          </w:tcPr>
+          <w:p>
+            <w:pPr>
+              <w:spacing w:after="0"/>
+            </w:pPr>
+            <w:r>
+              <w:rPr>
+                <w:rFonts w:ascii="Microsoft YaHei" w:hAnsi="Microsoft YaHei" w:eastAsia="Microsoft YaHei"/>
+                <w:sz w:val="16"/>
+              </w:rPr>
+              <w:t>8</w:t>
+            </w:r>
+          </w:p>
+        </w:tc>
+        <w:tc>
+          <w:tcPr>
+            <w:tcW w:type="dxa" w:w="7992"/>
+            <w:tcMar>
+              <w:top w:w="90" w:type="dxa"/>
+              <w:start w:w="100" w:type="dxa"/>
+              <w:bottom w:w="90" w:type="dxa"/>
+              <w:end w:w="100" w:type="dxa"/>
+            </w:tcMar>
+            <w:shd w:fill="F8FAFC"/>
+            <w:vAlign w:val="center"/>
+          </w:tcPr>
+          <w:p>
+            <w:pPr>
+              <w:spacing w:after="0"/>
+            </w:pPr>
+            <w:r>
+              <w:rPr>
+                <w:rFonts w:ascii="Microsoft YaHei" w:hAnsi="Microsoft YaHei" w:eastAsia="Microsoft YaHei"/>
+                <w:sz w:val="16"/>
+              </w:rPr>
+              <w:t>使用现场图片完成 /api/detect 全链路测试</w:t>
+            </w:r>
+          </w:p>
+        </w:tc>
+        <w:tc>
+          <w:tcPr>
+            <w:tcW w:type="dxa" w:w="2088"/>
+            <w:tcMar>
+              <w:top w:w="90" w:type="dxa"/>
+              <w:start w:w="100" w:type="dxa"/>
+              <w:bottom w:w="90" w:type="dxa"/>
+              <w:end w:w="100" w:type="dxa"/>
+            </w:tcMar>
+            <w:shd w:fill="F8FAFC"/>
+            <w:vAlign w:val="center"/>
+          </w:tcPr>
+          <w:p>
+            <w:pPr>
+              <w:spacing w:after="0"/>
+            </w:pPr>
+            <w:r>
+              <w:rPr>
+                <w:rFonts w:ascii="Microsoft YaHei" w:hAnsi="Microsoft YaHei" w:eastAsia="Microsoft YaHei"/>
+                <w:sz w:val="16"/>
+              </w:rPr>
+              <w:t>□ 通过</w:t>
+            </w:r>
+          </w:p>
+        </w:tc>
+      </w:tr>
+    </w:tbl>
+    <w:p>
+      <w:pPr>
+        <w:spacing w:after="0"/>
+      </w:pPr>
+    </w:p>
+    <w:p>
+      <w:pPr>
+        <w:spacing w:before="80" w:after="140"/>
+        <w:ind w:left="198"/>
+        <w:shd w:fill="FDECEC"/>
+        <w:pBdr>
+          <w:left w:val="single" w:sz="24" w:space="6" w:color="B42318"/>
+        </w:pBdr>
+      </w:pPr>
+      <w:r>
+        <w:rPr>
+          <w:rFonts w:ascii="Microsoft YaHei" w:hAnsi="Microsoft YaHei" w:eastAsia="Microsoft YaHei"/>
+          <w:b/>
+          <w:color w:val="B42318"/>
+          <w:sz w:val="18"/>
+        </w:rPr>
+        <w:t xml:space="preserve">兼容边界  </w:t>
+      </w:r>
+      <w:r>
+        <w:rPr>
+          <w:rFonts w:ascii="Microsoft YaHei" w:hAnsi="Microsoft YaHei" w:eastAsia="Microsoft YaHei"/>
+          <w:sz w:val="18"/>
+        </w:rPr>
+        <w:t>RHEL 8.3 兼容指平台源代码和服务架构可运行；具体模型能否加载取决于 GPU 驱动、CUDA、PyTorch/PaddlePaddle 及量化库的版本组合，部署前必须在目标服务器完成实际验证。</w:t>
       </w:r>
     </w:p>
     <w:sectPr>

</xml_diff>